<commit_message>
Standardize student handouts and appendices
</commit_message>
<xml_diff>
--- a/STARLAB_Unit_1/Appendixes/Appendix_A_What_Counts_as_Research.docx
+++ b/STARLAB_Unit_1/Appendixes/Appendix_A_What_Counts_as_Research.docx
@@ -4,7 +4,22 @@
   <w:body>
     <w:p>
       <w:pPr>
-        <w:pStyle w:val="Heading1"/>
+        <w:pStyle w:val="STARLABKicker"/>
+      </w:pPr>
+      <w:r>
+        <w:rPr>
+          <w:rFonts w:ascii="Arial" w:hAnsi="Arial" w:eastAsia="Arial" w:cs="Arial"/>
+          <w:color w:val="E31B23"/>
+          <w:sz w:val="18"/>
+          <w:szCs w:val="18"/>
+          <w:b w:val="1"/>
+        </w:rPr>
+        <w:t>STARLAB</w:t>
+      </w:r>
+    </w:p>
+    <w:p>
+      <w:pPr>
+        <w:pStyle w:val="STARLABResourceTitle"/>
         <w:keepNext w:val="0"/>
         <w:keepLines w:val="0"/>
         <w:spacing w:before="480" w:lineRule="auto"/>
@@ -15,27 +30,52 @@
           <w:szCs w:val="46"/>
         </w:rPr>
       </w:pPr>
-      <w:bookmarkStart w:colFirst="0" w:colLast="0" w:name="_4tkvs2ty71wt" w:id="84"/>
-      <w:bookmarkEnd w:id="84"/>
       <w:r>
         <w:rPr>
+          <w:rFonts w:ascii="Arial" w:hAnsi="Arial" w:eastAsia="Arial" w:cs="Arial"/>
+          <w:color w:val="111111"/>
+          <w:sz w:val="38"/>
+          <w:szCs w:val="38"/>
           <w:b w:val="1"/>
-          <w:bCs w:val="1"/>
-          <w:sz w:val="46"/>
-          <w:szCs w:val="46"/>
-          <w:rtl w:val="0"/>
         </w:rPr>
-        <w:t xml:space="preserve">Appendix A: What Counts as Research?</w:t>
+        <w:t>What Counts as Research</w:t>
       </w:r>
     </w:p>
     <w:p>
       <w:pPr>
+        <w:pStyle w:val="STARLABResourceMeta"/>
+      </w:pPr>
+      <w:r>
+        <w:rPr>
+          <w:rFonts w:ascii="Arial" w:hAnsi="Arial" w:eastAsia="Arial" w:cs="Arial"/>
+          <w:color w:val="555555"/>
+          <w:sz w:val="17"/>
+          <w:szCs w:val="17"/>
+          <w:b w:val="1"/>
+        </w:rPr>
+        <w:t>Unit 1 | Appendix A | Week 1 | Required</w:t>
+      </w:r>
+    </w:p>
+    <w:p>
+      <w:pPr>
+        <w:pStyle w:val="STARLABDivider"/>
+        <w:pBdr>
+          <w:bottom w:val="single" w:sz="12" w:space="1" w:color="E31B23"/>
+        </w:pBdr>
+      </w:pPr>
+    </w:p>
+    <w:p>
+      <w:pPr>
         <w:spacing w:after="240" w:before="240" w:lineRule="auto"/>
         <w:rPr/>
       </w:pPr>
       <w:r>
         <w:rPr>
+          <w:rFonts w:ascii="Arial" w:hAnsi="Arial" w:eastAsia="Arial" w:cs="Arial"/>
           <w:rtl w:val="0"/>
+          <w:color w:val="111111"/>
+          <w:sz w:val="18"/>
+          <w:szCs w:val="18"/>
         </w:rPr>
         <w:t xml:space="preserve">Research is a systematic process of asking questions, collecting evidence, analyzing information, and drawing conclusions or making design decisions.</w:t>
       </w:r>
@@ -57,11 +97,13 @@
       <w:bookmarkEnd w:id="85"/>
       <w:r>
         <w:rPr>
+          <w:rFonts w:ascii="Arial" w:hAnsi="Arial" w:eastAsia="Arial" w:cs="Arial"/>
           <w:b w:val="1"/>
           <w:bCs w:val="1"/>
-          <w:sz w:val="34"/>
-          <w:szCs w:val="34"/>
+          <w:sz w:val="22"/>
+          <w:szCs w:val="22"/>
           <w:rtl w:val="0"/>
+          <w:color w:val="111111"/>
         </w:rPr>
         <w:t xml:space="preserve">Traditional Classroom Lab</w:t>
       </w:r>
@@ -73,7 +115,11 @@
       </w:pPr>
       <w:r>
         <w:rPr>
+          <w:rFonts w:ascii="Arial" w:hAnsi="Arial" w:eastAsia="Arial" w:cs="Arial"/>
           <w:rtl w:val="0"/>
+          <w:color w:val="111111"/>
+          <w:sz w:val="18"/>
+          <w:szCs w:val="18"/>
         </w:rPr>
         <w:t xml:space="preserve">A traditional classroom lab often has a known outcome and a shared procedure. The purpose is usually to learn or confirm a concept.</w:t>
       </w:r>
@@ -85,7 +131,11 @@
       </w:pPr>
       <w:r>
         <w:rPr>
+          <w:rFonts w:ascii="Arial" w:hAnsi="Arial" w:eastAsia="Arial" w:cs="Arial"/>
           <w:rtl w:val="0"/>
+          <w:color w:val="111111"/>
+          <w:sz w:val="18"/>
+          <w:szCs w:val="18"/>
         </w:rPr>
         <w:t xml:space="preserve">Example:</w:t>
       </w:r>
@@ -97,7 +147,11 @@
       </w:pPr>
       <w:r>
         <w:rPr>
+          <w:rFonts w:ascii="Arial" w:hAnsi="Arial" w:eastAsia="Arial" w:cs="Arial"/>
           <w:rtl w:val="0"/>
+          <w:color w:val="111111"/>
+          <w:sz w:val="18"/>
+          <w:szCs w:val="18"/>
         </w:rPr>
         <w:t xml:space="preserve">“All students test how mass affects acceleration using the same materials and procedure.”</w:t>
       </w:r>
@@ -119,11 +173,13 @@
       <w:bookmarkEnd w:id="86"/>
       <w:r>
         <w:rPr>
+          <w:rFonts w:ascii="Arial" w:hAnsi="Arial" w:eastAsia="Arial" w:cs="Arial"/>
           <w:b w:val="1"/>
           <w:bCs w:val="1"/>
-          <w:sz w:val="34"/>
-          <w:szCs w:val="34"/>
+          <w:sz w:val="22"/>
+          <w:szCs w:val="22"/>
           <w:rtl w:val="0"/>
+          <w:color w:val="111111"/>
         </w:rPr>
         <w:t xml:space="preserve">Demonstration</w:t>
       </w:r>
@@ -135,7 +191,11 @@
       </w:pPr>
       <w:r>
         <w:rPr>
+          <w:rFonts w:ascii="Arial" w:hAnsi="Arial" w:eastAsia="Arial" w:cs="Arial"/>
           <w:rtl w:val="0"/>
+          <w:color w:val="111111"/>
+          <w:sz w:val="18"/>
+          <w:szCs w:val="18"/>
         </w:rPr>
         <w:t xml:space="preserve">A demonstration shows a scientific idea but does not necessarily answer a new question.</w:t>
       </w:r>
@@ -147,7 +207,11 @@
       </w:pPr>
       <w:r>
         <w:rPr>
+          <w:rFonts w:ascii="Arial" w:hAnsi="Arial" w:eastAsia="Arial" w:cs="Arial"/>
           <w:rtl w:val="0"/>
+          <w:color w:val="111111"/>
+          <w:sz w:val="18"/>
+          <w:szCs w:val="18"/>
         </w:rPr>
         <w:t xml:space="preserve">Example:</w:t>
       </w:r>
@@ -159,7 +223,11 @@
       </w:pPr>
       <w:r>
         <w:rPr>
+          <w:rFonts w:ascii="Arial" w:hAnsi="Arial" w:eastAsia="Arial" w:cs="Arial"/>
           <w:rtl w:val="0"/>
+          <w:color w:val="111111"/>
+          <w:sz w:val="18"/>
+          <w:szCs w:val="18"/>
         </w:rPr>
         <w:t xml:space="preserve">“Making elephant toothpaste to show a chemical reaction.”</w:t>
       </w:r>
@@ -181,11 +249,13 @@
       <w:bookmarkEnd w:id="87"/>
       <w:r>
         <w:rPr>
+          <w:rFonts w:ascii="Arial" w:hAnsi="Arial" w:eastAsia="Arial" w:cs="Arial"/>
           <w:b w:val="1"/>
           <w:bCs w:val="1"/>
-          <w:sz w:val="34"/>
-          <w:szCs w:val="34"/>
+          <w:sz w:val="22"/>
+          <w:szCs w:val="22"/>
           <w:rtl w:val="0"/>
+          <w:color w:val="111111"/>
         </w:rPr>
         <w:t xml:space="preserve">Scientific Research Project</w:t>
       </w:r>
@@ -197,7 +267,11 @@
       </w:pPr>
       <w:r>
         <w:rPr>
+          <w:rFonts w:ascii="Arial" w:hAnsi="Arial" w:eastAsia="Arial" w:cs="Arial"/>
           <w:rtl w:val="0"/>
+          <w:color w:val="111111"/>
+          <w:sz w:val="18"/>
+          <w:szCs w:val="18"/>
         </w:rPr>
         <w:t xml:space="preserve">A scientific research project investigates a specific question using evidence.</w:t>
       </w:r>
@@ -209,7 +283,11 @@
       </w:pPr>
       <w:r>
         <w:rPr>
+          <w:rFonts w:ascii="Arial" w:hAnsi="Arial" w:eastAsia="Arial" w:cs="Arial"/>
           <w:rtl w:val="0"/>
+          <w:color w:val="111111"/>
+          <w:sz w:val="18"/>
+          <w:szCs w:val="18"/>
         </w:rPr>
         <w:t xml:space="preserve">Example:</w:t>
       </w:r>
@@ -221,7 +299,11 @@
       </w:pPr>
       <w:r>
         <w:rPr>
+          <w:rFonts w:ascii="Arial" w:hAnsi="Arial" w:eastAsia="Arial" w:cs="Arial"/>
           <w:rtl w:val="0"/>
+          <w:color w:val="111111"/>
+          <w:sz w:val="18"/>
+          <w:szCs w:val="18"/>
         </w:rPr>
         <w:t xml:space="preserve">“How does hydrogen peroxide concentration affect the rate of oxygen gas production in a catalyzed decomposition reaction?”</w:t>
       </w:r>
@@ -243,11 +325,13 @@
       <w:bookmarkEnd w:id="88"/>
       <w:r>
         <w:rPr>
+          <w:rFonts w:ascii="Arial" w:hAnsi="Arial" w:eastAsia="Arial" w:cs="Arial"/>
           <w:b w:val="1"/>
           <w:bCs w:val="1"/>
-          <w:sz w:val="34"/>
-          <w:szCs w:val="34"/>
+          <w:sz w:val="22"/>
+          <w:szCs w:val="22"/>
           <w:rtl w:val="0"/>
+          <w:color w:val="111111"/>
         </w:rPr>
         <w:t xml:space="preserve">Engineering Design Project</w:t>
       </w:r>
@@ -259,7 +343,11 @@
       </w:pPr>
       <w:r>
         <w:rPr>
+          <w:rFonts w:ascii="Arial" w:hAnsi="Arial" w:eastAsia="Arial" w:cs="Arial"/>
           <w:rtl w:val="0"/>
+          <w:color w:val="111111"/>
+          <w:sz w:val="18"/>
+          <w:szCs w:val="18"/>
         </w:rPr>
         <w:t xml:space="preserve">An engineering project defines a problem, builds or models a solution, tests performance, and improves the design.</w:t>
       </w:r>
@@ -271,7 +359,11 @@
       </w:pPr>
       <w:r>
         <w:rPr>
+          <w:rFonts w:ascii="Arial" w:hAnsi="Arial" w:eastAsia="Arial" w:cs="Arial"/>
           <w:rtl w:val="0"/>
+          <w:color w:val="111111"/>
+          <w:sz w:val="18"/>
+          <w:szCs w:val="18"/>
         </w:rPr>
         <w:t xml:space="preserve">Example:</w:t>
       </w:r>
@@ -283,7 +375,11 @@
       </w:pPr>
       <w:r>
         <w:rPr>
+          <w:rFonts w:ascii="Arial" w:hAnsi="Arial" w:eastAsia="Arial" w:cs="Arial"/>
           <w:rtl w:val="0"/>
+          <w:color w:val="111111"/>
+          <w:sz w:val="18"/>
+          <w:szCs w:val="18"/>
         </w:rPr>
         <w:t xml:space="preserve">“How can a low-cost insulation container be designed to minimize temperature change over one hour?”</w:t>
       </w:r>
@@ -305,11 +401,13 @@
       <w:bookmarkEnd w:id="89"/>
       <w:r>
         <w:rPr>
+          <w:rFonts w:ascii="Arial" w:hAnsi="Arial" w:eastAsia="Arial" w:cs="Arial"/>
           <w:b w:val="1"/>
           <w:bCs w:val="1"/>
-          <w:sz w:val="34"/>
-          <w:szCs w:val="34"/>
+          <w:sz w:val="22"/>
+          <w:szCs w:val="22"/>
           <w:rtl w:val="0"/>
+          <w:color w:val="111111"/>
         </w:rPr>
         <w:t xml:space="preserve">Data Analysis Project</w:t>
       </w:r>
@@ -321,7 +419,11 @@
       </w:pPr>
       <w:r>
         <w:rPr>
+          <w:rFonts w:ascii="Arial" w:hAnsi="Arial" w:eastAsia="Arial" w:cs="Arial"/>
           <w:rtl w:val="0"/>
+          <w:color w:val="111111"/>
+          <w:sz w:val="18"/>
+          <w:szCs w:val="18"/>
         </w:rPr>
         <w:t xml:space="preserve">A data analysis project uses existing data to investigate a question.</w:t>
       </w:r>
@@ -333,7 +435,11 @@
       </w:pPr>
       <w:r>
         <w:rPr>
+          <w:rFonts w:ascii="Arial" w:hAnsi="Arial" w:eastAsia="Arial" w:cs="Arial"/>
           <w:rtl w:val="0"/>
+          <w:color w:val="111111"/>
+          <w:sz w:val="18"/>
+          <w:szCs w:val="18"/>
         </w:rPr>
         <w:t xml:space="preserve">Example:</w:t>
       </w:r>
@@ -345,33 +451,68 @@
       </w:pPr>
       <w:r>
         <w:rPr>
+          <w:rFonts w:ascii="Arial" w:hAnsi="Arial" w:eastAsia="Arial" w:cs="Arial"/>
           <w:rtl w:val="0"/>
+          <w:color w:val="111111"/>
+          <w:sz w:val="18"/>
+          <w:szCs w:val="18"/>
         </w:rPr>
         <w:t xml:space="preserve">“How does local air temperature correlate with ozone concentration during summer months using publicly available environmental data?”</w:t>
       </w:r>
     </w:p>
-    <w:p>
-      <w:pPr>
-        <w:rPr/>
-      </w:pPr>
-      <w:r>
-        <w:pict>
-          <v:rect style="width:0.0pt;height:1.5pt" o:hr="t" o:hrstd="t" o:hralign="center" fillcolor="#A0A0A0" stroked="f"/>
-        </w:pict>
-      </w:r>
-      <w:r>
-        <w:rPr>
-          <w:rtl w:val="0"/>
-        </w:rPr>
-      </w:r>
-    </w:p>
     <w:sectPr>
-      <w:pgSz w:h="15840" w:w="12240" w:orient="portrait"/>
-      <w:pgMar w:bottom="1440" w:top="1440" w:left="1440" w:right="1440" w:header="720" w:footer="720"/>
+      <w:headerReference w:type="default" r:id="rId6"/>
+      <w:footerReference w:type="default" r:id="rId7"/>
+      <w:pgSz w:h="15840" w:w="12240"/>
+      <w:pgMar w:bottom="936" w:top="936" w:left="1440" w:right="1440" w:header="504" w:footer="504"/>
       <w:pgNumType w:start="1"/>
     </w:sectPr>
   </w:body>
 </w:document>
+</file>
+
+<file path=word/footer1.xml><?xml version="1.0" encoding="utf-8"?>
+<w:ftr xmlns:m="http://schemas.openxmlformats.org/officeDocument/2006/math" xmlns:mc="http://schemas.openxmlformats.org/markup-compatibility/2006" xmlns:mo="http://schemas.microsoft.com/office/mac/office/2008/main" xmlns:mv="urn:schemas-microsoft-com:mac:vml" xmlns:o="urn:schemas-microsoft-com:office:office" xmlns:r="http://schemas.openxmlformats.org/officeDocument/2006/relationships" xmlns:v="urn:schemas-microsoft-com:vml" xmlns:w10="urn:schemas-microsoft-com:office:word" xmlns:w14="http://schemas.microsoft.com/office/word/2010/wordml" xmlns:w="http://schemas.openxmlformats.org/wordprocessingml/2006/main" xmlns:wne="http://schemas.microsoft.com/office/word/2006/wordml" xmlns:wp14="http://schemas.microsoft.com/office/word/2010/wordprocessingDrawing" xmlns:wp="http://schemas.openxmlformats.org/drawingml/2006/wordprocessingDrawing" xmlns:wpc="http://schemas.microsoft.com/office/word/2010/wordprocessingCanvas" xmlns:wpg="http://schemas.microsoft.com/office/word/2010/wordprocessingGroup" xmlns:wpi="http://schemas.microsoft.com/office/word/2010/wordprocessingInk" xmlns:wps="http://schemas.microsoft.com/office/word/2010/wordprocessingShape" mc:Ignorable="w14 wp14">
+  <w:p>
+    <w:pPr>
+      <w:pStyle w:val="Footer"/>
+      <w:spacing w:before="40" w:after="0"/>
+      <w:jc w:val="center"/>
+    </w:pPr>
+    <w:r>
+      <w:rPr>
+        <w:rFonts w:ascii="Arial" w:hAnsi="Arial" w:eastAsia="Arial" w:cs="Arial"/>
+        <w:color w:val="555555"/>
+        <w:sz w:val="16"/>
+        <w:szCs w:val="16"/>
+        <w:b w:val="0"/>
+      </w:rPr>
+      <w:t xml:space="preserve">STARLAB | UNIT 1 | APPENDIX A | PAGE </w:t>
+    </w:r>
+    <w:r>
+      <w:rPr>
+        <w:rFonts w:ascii="Arial" w:hAnsi="Arial" w:eastAsia="Arial" w:cs="Arial"/>
+        <w:color w:val="555555"/>
+        <w:sz w:val="16"/>
+        <w:szCs w:val="16"/>
+        <w:b w:val="0"/>
+      </w:rPr>
+      <w:fldChar w:fldCharType="begin"/>
+      <w:instrText xml:space="preserve"> PAGE </w:instrText>
+      <w:fldChar w:fldCharType="end"/>
+    </w:r>
+  </w:p>
+</w:ftr>
+</file>
+
+<file path=word/header1.xml><?xml version="1.0" encoding="utf-8"?>
+<w:hdr xmlns:m="http://schemas.openxmlformats.org/officeDocument/2006/math" xmlns:mc="http://schemas.openxmlformats.org/markup-compatibility/2006" xmlns:mo="http://schemas.microsoft.com/office/mac/office/2008/main" xmlns:mv="urn:schemas-microsoft-com:mac:vml" xmlns:o="urn:schemas-microsoft-com:office:office" xmlns:r="http://schemas.openxmlformats.org/officeDocument/2006/relationships" xmlns:v="urn:schemas-microsoft-com:vml" xmlns:w10="urn:schemas-microsoft-com:office:word" xmlns:w14="http://schemas.microsoft.com/office/word/2010/wordml" xmlns:w="http://schemas.openxmlformats.org/wordprocessingml/2006/main" xmlns:wne="http://schemas.microsoft.com/office/word/2006/wordml" xmlns:wp14="http://schemas.microsoft.com/office/word/2010/wordprocessingDrawing" xmlns:wp="http://schemas.openxmlformats.org/drawingml/2006/wordprocessingDrawing" xmlns:wpc="http://schemas.microsoft.com/office/word/2010/wordprocessingCanvas" xmlns:wpg="http://schemas.microsoft.com/office/word/2010/wordprocessingGroup" xmlns:wpi="http://schemas.microsoft.com/office/word/2010/wordprocessingInk" xmlns:wps="http://schemas.microsoft.com/office/word/2010/wordprocessingShape" mc:Ignorable="w14 wp14">
+  <w:p>
+    <w:pPr>
+      <w:pStyle w:val="Header"/>
+    </w:pPr>
+  </w:p>
+</w:hdr>
 </file>
 
 <file path=word/numbering.xml><?xml version="1.0" encoding="utf-8"?>
@@ -8545,19 +8686,32 @@
   </w:style>
   <w:style w:type="paragraph" w:styleId="Normal" w:default="1">
     <w:name w:val="normal"/>
+    <w:pPr>
+      <w:keepLines w:val="0"/>
+      <w:spacing w:before="0" w:after="40" w:line="240" w:lineRule="auto"/>
+    </w:pPr>
+    <w:rPr>
+      <w:rFonts w:ascii="Arial" w:hAnsi="Arial" w:eastAsia="Arial"/>
+      <w:b w:val="0"/>
+      <w:color w:val="111111"/>
+      <w:sz w:val="18"/>
+    </w:rPr>
   </w:style>
   <w:style w:type="paragraph" w:styleId="Heading1">
     <w:name w:val="heading 1"/>
     <w:basedOn w:val="Normal"/>
     <w:next w:val="Normal"/>
     <w:pPr>
-      <w:keepNext w:val="1"/>
+      <w:keepNext/>
       <w:keepLines w:val="1"/>
       <w:pageBreakBefore w:val="0"/>
-      <w:spacing w:after="120" w:before="400" w:lineRule="auto"/>
+      <w:spacing w:after="60" w:before="180" w:lineRule="auto" w:line="240"/>
     </w:pPr>
     <w:rPr>
-      <w:sz w:val="40"/>
+      <w:rFonts w:ascii="Arial" w:hAnsi="Arial" w:eastAsia="Arial"/>
+      <w:b/>
+      <w:color w:val="E31B23"/>
+      <w:sz w:val="27"/>
       <w:szCs w:val="40"/>
     </w:rPr>
   </w:style>
@@ -8566,15 +8720,17 @@
     <w:basedOn w:val="Normal"/>
     <w:next w:val="Normal"/>
     <w:pPr>
-      <w:keepNext w:val="1"/>
+      <w:keepNext/>
       <w:keepLines w:val="1"/>
       <w:pageBreakBefore w:val="0"/>
-      <w:spacing w:after="120" w:before="360" w:lineRule="auto"/>
+      <w:spacing w:after="40" w:before="120" w:lineRule="auto" w:line="240"/>
     </w:pPr>
     <w:rPr>
-      <w:b w:val="0"/>
+      <w:rFonts w:ascii="Arial" w:hAnsi="Arial" w:eastAsia="Arial"/>
+      <w:b/>
       <w:bCs w:val="0"/>
-      <w:sz w:val="32"/>
+      <w:color w:val="111111"/>
+      <w:sz w:val="22"/>
       <w:szCs w:val="32"/>
     </w:rPr>
   </w:style>
@@ -8583,16 +8739,17 @@
     <w:basedOn w:val="Normal"/>
     <w:next w:val="Normal"/>
     <w:pPr>
-      <w:keepNext w:val="1"/>
+      <w:keepNext/>
       <w:keepLines w:val="1"/>
       <w:pageBreakBefore w:val="0"/>
-      <w:spacing w:after="80" w:before="320" w:lineRule="auto"/>
+      <w:spacing w:after="40" w:before="100" w:lineRule="auto" w:line="240"/>
     </w:pPr>
     <w:rPr>
-      <w:b w:val="0"/>
+      <w:rFonts w:ascii="Arial" w:hAnsi="Arial" w:eastAsia="Arial"/>
+      <w:b/>
       <w:bCs w:val="0"/>
-      <w:color w:val="434343"/>
-      <w:sz w:val="28"/>
+      <w:color w:val="555555"/>
+      <w:sz w:val="20"/>
       <w:szCs w:val="28"/>
     </w:rPr>
   </w:style>
@@ -8735,6 +8892,117 @@
       <w:tblStyleColBandSize w:val="1"/>
       <w:tblCellMar/>
     </w:tblPr>
+  </w:style>
+  <w:style w:type="paragraph" w:customStyle="1" w:styleId="STARLABKicker">
+    <w:name w:val="STARLAB Kicker"/>
+    <w:pPr>
+      <w:spacing w:before="0" w:after="60" w:line="240" w:lineRule="auto"/>
+    </w:pPr>
+    <w:rPr>
+      <w:rFonts w:ascii="Arial" w:hAnsi="Arial" w:eastAsia="Arial"/>
+      <w:b/>
+      <w:caps/>
+      <w:color w:val="E31B23"/>
+      <w:sz w:val="18"/>
+    </w:rPr>
+  </w:style>
+  <w:style w:type="paragraph" w:customStyle="1" w:styleId="STARLABResourceTitle">
+    <w:name w:val="STARLAB Resource Title"/>
+    <w:pPr>
+      <w:spacing w:before="0" w:after="60" w:line="240" w:lineRule="auto"/>
+    </w:pPr>
+    <w:rPr>
+      <w:rFonts w:ascii="Arial" w:hAnsi="Arial" w:eastAsia="Arial"/>
+      <w:b/>
+      <w:color w:val="111111"/>
+      <w:sz w:val="38"/>
+    </w:rPr>
+  </w:style>
+  <w:style w:type="paragraph" w:customStyle="1" w:styleId="STARLABResourceMeta">
+    <w:name w:val="STARLAB Resource Meta"/>
+    <w:pPr>
+      <w:spacing w:before="0" w:after="80" w:line="240" w:lineRule="auto"/>
+    </w:pPr>
+    <w:rPr>
+      <w:rFonts w:ascii="Arial" w:hAnsi="Arial" w:eastAsia="Arial"/>
+      <w:b/>
+      <w:color w:val="555555"/>
+      <w:sz w:val="17"/>
+    </w:rPr>
+  </w:style>
+  <w:style w:type="paragraph" w:customStyle="1" w:styleId="STARLABDivider">
+    <w:name w:val="STARLAB Divider"/>
+    <w:pPr>
+      <w:spacing w:before="0" w:after="160" w:line="240" w:lineRule="auto"/>
+    </w:pPr>
+    <w:rPr>
+      <w:rFonts w:ascii="Arial" w:hAnsi="Arial" w:eastAsia="Arial"/>
+      <w:b w:val="0"/>
+      <w:color w:val="E31B23"/>
+      <w:sz w:val="4"/>
+    </w:rPr>
+  </w:style>
+  <w:style w:type="paragraph" w:customStyle="1" w:styleId="STARLABPrompt">
+    <w:name w:val="STARLAB Prompt"/>
+    <w:pPr>
+      <w:spacing w:before="60" w:after="40" w:line="247" w:lineRule="auto"/>
+    </w:pPr>
+    <w:rPr>
+      <w:rFonts w:ascii="Arial" w:hAnsi="Arial" w:eastAsia="Arial"/>
+      <w:b/>
+      <w:color w:val="111111"/>
+      <w:sz w:val="20"/>
+    </w:rPr>
+  </w:style>
+  <w:style w:type="paragraph" w:customStyle="1" w:styleId="STARLABUseNote">
+    <w:name w:val="STARLAB Use Note"/>
+    <w:pPr>
+      <w:spacing w:before="0" w:after="80" w:line="247" w:lineRule="auto"/>
+    </w:pPr>
+    <w:rPr>
+      <w:rFonts w:ascii="Arial" w:hAnsi="Arial" w:eastAsia="Arial"/>
+      <w:b w:val="0"/>
+      <w:color w:val="555555"/>
+      <w:sz w:val="17"/>
+    </w:rPr>
+  </w:style>
+  <w:style w:type="paragraph" w:customStyle="1" w:styleId="STARLABResponseLine">
+    <w:name w:val="STARLAB Response Line"/>
+    <w:pPr>
+      <w:spacing w:before="0" w:after="60" w:line="240" w:lineRule="auto"/>
+    </w:pPr>
+    <w:rPr>
+      <w:rFonts w:ascii="Arial" w:hAnsi="Arial" w:eastAsia="Arial"/>
+      <w:b w:val="0"/>
+      <w:color w:val="111111"/>
+      <w:sz w:val="20"/>
+    </w:rPr>
+  </w:style>
+  <w:style w:type="paragraph" w:customStyle="1" w:styleId="ListBullet">
+    <w:name w:val="List Bullet"/>
+    <w:pPr>
+      <w:spacing w:before="0" w:after="40" w:line="240" w:lineRule="auto"/>
+      <w:ind w:left="547" w:hanging="274"/>
+    </w:pPr>
+    <w:rPr>
+      <w:rFonts w:ascii="Arial" w:hAnsi="Arial" w:eastAsia="Arial"/>
+      <w:b w:val="0"/>
+      <w:color w:val="111111"/>
+      <w:sz w:val="18"/>
+    </w:rPr>
+  </w:style>
+  <w:style w:type="paragraph" w:customStyle="1" w:styleId="ListNumber">
+    <w:name w:val="List Number"/>
+    <w:pPr>
+      <w:spacing w:before="0" w:after="40" w:line="240" w:lineRule="auto"/>
+      <w:ind w:left="547" w:hanging="274"/>
+    </w:pPr>
+    <w:rPr>
+      <w:rFonts w:ascii="Arial" w:hAnsi="Arial" w:eastAsia="Arial"/>
+      <w:b w:val="0"/>
+      <w:color w:val="111111"/>
+      <w:sz w:val="18"/>
+    </w:rPr>
   </w:style>
 </w:styles>
 </file>

</xml_diff>